<commit_message>
feat: integrate chapters IV and V to manuscript, fix accessibility, and enhance mobile view responsiveness
</commit_message>
<xml_diff>
--- a/edited-AEGIS.docx
+++ b/edited-AEGIS.docx
@@ -18533,6 +18533,2300 @@
         <w:ind w:firstLine="720"/>
         <w:jc w:val="both"/>
       </w:pPr>
+    </w:p>
+    <w:p>
+      <w:pPr/>
+      <w:r>
+        <w:br w:type="page"/>
+      </w:r>
+    </w:p>
+    <w:p>
+      <w:pPr>
+        <w:pStyle w:val="Heading1"/>
+        <w:keepNext/>
+        <w:spacing w:line="276" w:lineRule="auto" w:before="240" w:after="120"/>
+      </w:pPr>
+      <w:r>
+        <w:rPr>
+          <w:b w:val="0"/>
+        </w:rPr>
+        <w:t>CHAPTER IV</w:t>
+      </w:r>
+    </w:p>
+    <w:p>
+      <w:pPr>
+        <w:pStyle w:val="Heading1"/>
+        <w:keepNext/>
+        <w:spacing w:line="276" w:lineRule="auto" w:before="240" w:after="120"/>
+      </w:pPr>
+      <w:r>
+        <w:rPr>
+          <w:b w:val="0"/>
+        </w:rPr>
+        <w:t>RESULTS AND DISCUSSION</w:t>
+      </w:r>
+    </w:p>
+    <w:p>
+      <w:pPr>
+        <w:spacing w:line="480" w:lineRule="auto" w:after="240"/>
+      </w:pPr>
+      <w:r>
+        <w:rPr>
+          <w:b w:val="0"/>
+        </w:rPr>
+        <w:t>This chapter presents the results of the development, testing, and evaluation of A.E.G.I.S. The discussion is organized according to the five work items outlined in Chapter III, followed by the results of AI module accuracy testing and User Acceptance Testing (UAT). Each section describes the implemented feature, its correspondence to the original requirements and objectives, and its implications for the CLSU OSA scholarship management workflow.</w:t>
+      </w:r>
+    </w:p>
+    <w:p>
+      <w:pPr>
+        <w:pStyle w:val="Heading2"/>
+        <w:keepNext/>
+        <w:spacing w:line="276" w:lineRule="auto" w:before="240" w:after="120"/>
+      </w:pPr>
+      <w:r>
+        <w:rPr>
+          <w:b w:val="0"/>
+        </w:rPr>
+        <w:t>Implemented System Modules</w:t>
+      </w:r>
+    </w:p>
+    <w:p>
+      <w:pPr>
+        <w:pStyle w:val="Heading3"/>
+        <w:keepNext/>
+        <w:spacing w:line="276" w:lineRule="auto" w:before="240" w:after="120"/>
+      </w:pPr>
+      <w:r>
+        <w:rPr>
+          <w:b w:val="0"/>
+        </w:rPr>
+        <w:t>Work Item 1: Database Architecture and Authentication</w:t>
+      </w:r>
+    </w:p>
+    <w:p>
+      <w:pPr>
+        <w:spacing w:line="480" w:lineRule="auto" w:after="240"/>
+      </w:pPr>
+      <w:r>
+        <w:rPr>
+          <w:b w:val="0"/>
+        </w:rPr>
+        <w:t>The database schema was successfully implemented using eleven normalized relational tables: users, student_profiles, scholarships, academic_terms, applications, documents, ai_results, status_logs, email_logs, user_invitations, and password_reset_tokens. All tables were created through Laravel's migration system, ensuring a version-controlled and reproducible schema. Referential integrity is enforced through foreign key constraints between related entities.</w:t>
+      </w:r>
+    </w:p>
+    <w:p>
+      <w:pPr>
+        <w:spacing w:line="480" w:lineRule="auto" w:after="240"/>
+      </w:pPr>
+      <w:r>
+        <w:rPr>
+          <w:b w:val="0"/>
+        </w:rPr>
+        <w:t>The authentication system implements Role-Based Access Control (RBAC) using Laravel middleware. Three distinct roles were implemented: Student, OSA Administrator, and Super Administrator. Each role is strictly bounded: students can access only their own application records, OSA administrators can view and modify all applications, and the Super Administrator has full system access including scholarship program configuration and analytics. Passwords are hashed using bcrypt, and sensitive fields in the student_profiles table—including full_name, clsu_id_number, and course—are encrypted at rest using AES-256 Eloquent casts in compliance with the data minimization and encryption requirements of R.A. 10173.</w:t>
+      </w:r>
+    </w:p>
+    <w:p>
+      <w:pPr>
+        <w:spacing w:line="480" w:lineRule="auto" w:after="240"/>
+      </w:pPr>
+      <w:r>
+        <w:rPr>
+          <w:b w:val="0"/>
+        </w:rPr>
+        <w:t>To ensure institutional validity and secure access, the student registration module enforces email verification. Student signups are strictly validated to require official CLSU institutional email domains (@clsu.edu.ph or @clsu2.edu.ph). Upon registration, Laravel's email verification contract (MustVerifyEmail) is triggered, sending a signed activation link via Brevo SMTP and redirecting the user to a dedicated verification prompt page. To streamline the user experience, the verification page incorporates JavaScript/Alpine polling that queries the backend status endpoint every 2 seconds, automatically redirecting the student to the dashboard once they click the verification link in their email client. Unverified login attempts are intercepted and locked, redirecting users back to the verification prompt.</w:t>
+      </w:r>
+    </w:p>
+    <w:p>
+      <w:pPr>
+        <w:spacing w:line="480" w:lineRule="auto" w:after="240"/>
+      </w:pPr>
+      <w:r>
+        <w:rPr>
+          <w:b w:val="0"/>
+        </w:rPr>
+        <w:t>For administrative staff management, the Super Administrator dashboard features a secure invite-and-activation workflow. The Super Administrator enters the institutional email of a new staff member, generating a unique invitation token stored in the user_invitations table. The system sends an email invitation, and the recipient clicks a link directing them to a secure password creation form to activate their administrative account, logging all outgoing notifications in the email_logs table.</w:t>
+      </w:r>
+    </w:p>
+    <w:p>
+      <w:pPr>
+        <w:spacing w:line="480" w:lineRule="auto" w:after="240"/>
+      </w:pPr>
+      <w:r>
+        <w:rPr>
+          <w:b w:val="0"/>
+        </w:rPr>
+        <w:t>The login interface presents a secure split-screen layout with CLSU institutional branding. Users are automatically redirected to their role-specific dashboard upon successful authentication. The system prevents unauthorized cross-role access: a student account cannot navigate to any admin route, and vice versa.</w:t>
+      </w:r>
+    </w:p>
+    <w:p>
+      <w:pPr>
+        <w:pStyle w:val="Heading3"/>
+        <w:keepNext/>
+        <w:spacing w:line="276" w:lineRule="auto" w:before="240" w:after="120"/>
+      </w:pPr>
+      <w:r>
+        <w:rPr>
+          <w:b w:val="0"/>
+        </w:rPr>
+        <w:t>Work Item 2: Student Application Portal</w:t>
+      </w:r>
+    </w:p>
+    <w:p>
+      <w:pPr>
+        <w:spacing w:line="480" w:lineRule="auto" w:after="240"/>
+      </w:pPr>
+      <w:r>
+        <w:rPr>
+          <w:b w:val="0"/>
+        </w:rPr>
+        <w:t>The student-facing portal was implemented as a multi-step application flow accessible through any modern web browser, addressing the paper-based submission problem identified in Chapter I. The portal consists of three primary pages: the Application Form, the Student Dashboard, and the Student Profile.</w:t>
+      </w:r>
+    </w:p>
+    <w:p>
+      <w:pPr>
+        <w:spacing w:line="480" w:lineRule="auto" w:after="240"/>
+      </w:pPr>
+      <w:r>
+        <w:rPr>
+          <w:b/>
+        </w:rPr>
+        <w:t>Application Form.</w:t>
+      </w:r>
+      <w:r>
+        <w:rPr>
+          <w:b w:val="0"/>
+        </w:rPr>
+        <w:t xml:space="preserve"> The application form presents available scholarship programs as selectable cards, each displaying the program name, a brief description, and the maximum allowable GWA. Real-time GWA eligibility validation is applied client-side: when a student enters a GWA value that exceeds the scholarship's configured maximum, the eligibility badge changes from green to red and the submit button is disabled. This prevents ineligible submissions from entering the review queue before they are manually rejected by OSA staff, reducing unnecessary administrative load.</w:t>
+      </w:r>
+    </w:p>
+    <w:p>
+      <w:pPr>
+        <w:spacing w:line="480" w:lineRule="auto" w:after="240"/>
+      </w:pPr>
+      <w:r>
+        <w:rPr>
+          <w:b w:val="0"/>
+        </w:rPr>
+        <w:t>Document upload is implemented as a drag-and-drop upload zone that accepts JPEG and PNG files with a server-side size cap of 10 MB. Upon upload selection, an image preview is immediately rendered in the browser, allowing students to verify they have selected the correct file before submission. All uploaded COG files are renamed on the server using a SHA-256 UUID-based scheme, replacing any student-identifiable filename with an anonymous hexadecimal string. This protects student identity at rest and prevents filename-based inference attacks.</w:t>
+      </w:r>
+    </w:p>
+    <w:p>
+      <w:pPr>
+        <w:spacing w:line="480" w:lineRule="auto" w:after="240"/>
+      </w:pPr>
+      <w:r>
+        <w:rPr>
+          <w:b/>
+        </w:rPr>
+        <w:t>Student Dashboard.</w:t>
+      </w:r>
+      <w:r>
+        <w:rPr>
+          <w:b w:val="0"/>
+        </w:rPr>
+        <w:t xml:space="preserve"> The student dashboard presents a full-width status hero banner whose color dynamically reflects the current application status: amber for Pending, blue for Under Review, green for Approved, and red for Rejected. A three-step progress tracker embedded in the banner visually indicates the application's position in the review pipeline. Upon Approved status, a canvas-rendered confetti animation is triggered, providing a clear and celebratory confirmation to the student.</w:t>
+      </w:r>
+    </w:p>
+    <w:p>
+      <w:pPr>
+        <w:spacing w:line="480" w:lineRule="auto" w:after="240"/>
+      </w:pPr>
+      <w:r>
+        <w:rPr>
+          <w:b w:val="0"/>
+        </w:rPr>
+        <w:t>An audit timeline below the hero banner renders all status log entries in chronological order. Each entry displays the status label, transition timestamp, and any evaluator remarks recorded at the time of the decision. This provides students with a complete and transparent record of their application's review history, addressing the manual and opaque communication process previously used at the CLSU OSA.</w:t>
+      </w:r>
+    </w:p>
+    <w:p>
+      <w:pPr>
+        <w:spacing w:line="480" w:lineRule="auto" w:after="240"/>
+      </w:pPr>
+      <w:r>
+        <w:rPr>
+          <w:b/>
+        </w:rPr>
+        <w:t>Student Profile Management.</w:t>
+      </w:r>
+      <w:r>
+        <w:rPr>
+          <w:b w:val="0"/>
+        </w:rPr>
+        <w:t xml:space="preserve"> To allow applicants to maintain up-to-date administrative records, the portal includes a secure profile management interface (GET /student/profile). Students can edit their personal and academic details, including full name, CLSU ID number, college, course, year level, and contact number. The input validation layer enforces structural rules such as Philippine mobile formats (09XXXXXXXXX) and CLSU ID formats (YYYY-NNNN), and sensitive fields (clsu_id_number, contact_number) are cast via AES-256 Eloquent database encryption. Profile data is designed to automatically propagate to new applications and the approved PDF attachments, minimizing redundant input and preventing data entry errors.</w:t>
+      </w:r>
+    </w:p>
+    <w:p>
+      <w:pPr>
+        <w:pStyle w:val="Heading3"/>
+        <w:keepNext/>
+        <w:spacing w:line="276" w:lineRule="auto" w:before="240" w:after="120"/>
+      </w:pPr>
+      <w:r>
+        <w:rPr>
+          <w:b w:val="0"/>
+        </w:rPr>
+        <w:t>Work Item 3: AI Document Fraud Detection Module</w:t>
+      </w:r>
+    </w:p>
+    <w:p>
+      <w:pPr>
+        <w:spacing w:line="480" w:lineRule="auto" w:after="240"/>
+      </w:pPr>
+      <w:r>
+        <w:rPr>
+          <w:b w:val="0"/>
+        </w:rPr>
+        <w:t>The AI fraud detection module was implemented as a standalone Python Flask microservice running on Port 5000. The microservice exposes a single REST API endpoint that receives a COG image file path from the Laravel backend via an HTTP POST request and returns a JSON response containing the fraud probability score, classification label, and the server path to the generated Grad-CAM heatmap.</w:t>
+      </w:r>
+    </w:p>
+    <w:p>
+      <w:pPr>
+        <w:spacing w:line="480" w:lineRule="auto" w:after="240"/>
+      </w:pPr>
+      <w:r>
+        <w:rPr>
+          <w:b/>
+        </w:rPr>
+        <w:t>ELA Preprocessing.</w:t>
+      </w:r>
+      <w:r>
+        <w:rPr>
+          <w:b w:val="0"/>
+        </w:rPr>
+        <w:t xml:space="preserve"> Each submitted COG image is first re-saved as a JPEG at a controlled compression quality of Q=95. The error map E is computed as the absolute pixel-by-pixel difference between the original and recompressed images, formally expressed as:</w:t>
+      </w:r>
+    </w:p>
+    <w:p>
+      <w:pPr>
+        <w:spacing w:line="480" w:lineRule="auto" w:after="240"/>
+        <w:ind w:left="720"/>
+      </w:pPr>
+      <w:r>
+        <w:rPr>
+          <w:b/>
+          <w:i/>
+        </w:rPr>
+        <w:t>E(x, y) = |I(x, y) − I'(x, y)|</w:t>
+      </w:r>
+    </w:p>
+    <w:p>
+      <w:pPr>
+        <w:spacing w:line="480" w:lineRule="auto" w:after="240"/>
+      </w:pPr>
+      <w:r>
+        <w:rPr>
+          <w:b w:val="0"/>
+        </w:rPr>
+        <w:t>where (x, y) denotes each pixel coordinate. The resulting map is normalized to the [0, 255] range and resized to 224×224 pixels to conform to the ResNet-50 input specification. Areas of the document that have been digitally edited—such as replaced grade fields, modified GWA values, or clone-stamped seals—exhibit higher ELA residuals due to their distinct compression artifacts compared to the unmodified document areas.</w:t>
+      </w:r>
+    </w:p>
+    <w:p>
+      <w:pPr>
+        <w:spacing w:line="480" w:lineRule="auto" w:after="240"/>
+      </w:pPr>
+      <w:r>
+        <w:rPr>
+          <w:b/>
+        </w:rPr>
+        <w:t>CNN Classification.</w:t>
+      </w:r>
+      <w:r>
+        <w:rPr>
+          <w:b w:val="0"/>
+        </w:rPr>
+        <w:t xml:space="preserve"> The normalized ELA map is passed through the ResNet-50 Convolutional Neural Network. The model produces a continuous fraud probability score p ∈ [0, 1], which is multiplied by 100 to yield the Fraud Probability Score (FPS). The system applies a classification threshold of p = 0.50: documents with p &lt; 0.50 are classified as Authentic, and documents with p ≥ 0.50 are classified as Tampered. The FPS is further categorized into three risk tiers: </w:t>
+      </w:r>
+      <w:r>
+        <w:rPr>
+          <w:b/>
+        </w:rPr>
+        <w:t>Low Risk (FPS 0–39)</w:t>
+      </w:r>
+      <w:r>
+        <w:rPr>
+          <w:b w:val="0"/>
+        </w:rPr>
+        <w:t xml:space="preserve">, </w:t>
+      </w:r>
+      <w:r>
+        <w:rPr>
+          <w:b/>
+        </w:rPr>
+        <w:t>Moderate Risk (FPS 40–69)</w:t>
+      </w:r>
+      <w:r>
+        <w:rPr>
+          <w:b w:val="0"/>
+        </w:rPr>
+        <w:t xml:space="preserve">, and </w:t>
+      </w:r>
+      <w:r>
+        <w:rPr>
+          <w:b/>
+        </w:rPr>
+        <w:t>High Risk (FPS 70–100)</w:t>
+      </w:r>
+      <w:r>
+        <w:rPr>
+          <w:b w:val="0"/>
+        </w:rPr>
+        <w:t>, displayed using color-coded badges (green, amber, red) in the OSA administrator dashboard.</w:t>
+      </w:r>
+    </w:p>
+    <w:p>
+      <w:pPr>
+        <w:spacing w:line="480" w:lineRule="auto" w:after="240"/>
+      </w:pPr>
+      <w:r>
+        <w:rPr>
+          <w:b/>
+        </w:rPr>
+        <w:t>Grad-CAM Heatmap.</w:t>
+      </w:r>
+      <w:r>
+        <w:rPr>
+          <w:b w:val="0"/>
+        </w:rPr>
+        <w:t xml:space="preserve"> Following classification, the Grad-CAM algorithm is applied to the final convolutional layer of the ResNet-50 model to generate a visual heatmap. The heatmap is overlaid on the original COG image and displayed side-by-side with the unmodified document in the Forensics Review page. The hot (red) regions in the heatmap correspond to the document areas that most strongly influenced the model's classification decision, enabling OSA staff to identify the exact locations of suspected tampering without requiring any machine learning expertise.</w:t>
+      </w:r>
+    </w:p>
+    <w:p>
+      <w:pPr>
+        <w:spacing w:line="480" w:lineRule="auto" w:after="240"/>
+      </w:pPr>
+      <w:r>
+        <w:rPr>
+          <w:b w:val="0"/>
+        </w:rPr>
+        <w:t>To prevent the synchronous AI scan from blocking the Laravel request loop during high-load periods, the scan is dispatched as an asynchronous queued job (ScanDocumentJob) using the Laravel queue system with a database driver. The administrator dashboard displays a "Scanning…" status indicator while the job runs, and the page automatically refreshes upon completion. This architecture ensures that the OSA dashboard remains responsive during document analysis.</w:t>
+      </w:r>
+    </w:p>
+    <w:p>
+      <w:pPr>
+        <w:pStyle w:val="Heading3"/>
+        <w:keepNext/>
+        <w:spacing w:line="276" w:lineRule="auto" w:before="240" w:after="120"/>
+      </w:pPr>
+      <w:r>
+        <w:rPr>
+          <w:b w:val="0"/>
+        </w:rPr>
+        <w:t>Work Item 4: Administrator Dashboard and SMTP Notification</w:t>
+      </w:r>
+    </w:p>
+    <w:p>
+      <w:pPr>
+        <w:spacing w:line="480" w:lineRule="auto" w:after="240"/>
+      </w:pPr>
+      <w:r>
+        <w:rPr>
+          <w:b w:val="0"/>
+        </w:rPr>
+        <w:t>The OSA Administrator Dashboard presents all submitted applications in a paginated, filterable queue table. Administrators can filter the queue by applicant name or ID, scholarship program, application status, and academic term. Each row in the table displays the applicant's name and CLSU ID, the scholarship program, the declared GWA, the AI Fraud Probability Score chip (color-coded by risk tier), the current application status badge, and the submission timestamp. Clicking any row navigates the administrator to the Forensics Review page for that application.</w:t>
+      </w:r>
+    </w:p>
+    <w:p>
+      <w:pPr>
+        <w:spacing w:line="480" w:lineRule="auto" w:after="240"/>
+      </w:pPr>
+      <w:r>
+        <w:rPr>
+          <w:b/>
+        </w:rPr>
+        <w:t>Forensics Review Page.</w:t>
+      </w:r>
+      <w:r>
+        <w:rPr>
+          <w:b w:val="0"/>
+        </w:rPr>
+        <w:t xml:space="preserve"> The review page presents the complete forensic evaluation workspace in a two-column layout. The left column contains the dark-themed AI panel, which features an animated radial SVG ring that fills from 0 to the actual FPS value upon page load, providing an immediate visual indication of risk severity. Below the ring, a detail panel displays the model architecture (ResNet-50), preprocessing method (Error Level Analysis), and the classification label. The right column presents the document viewer, which renders the original COG and the Grad-CAM heatmap side by side. Administrators can click either image to open a full-screen lightbox view for detailed inspection.</w:t>
+      </w:r>
+    </w:p>
+    <w:p>
+      <w:pPr>
+        <w:spacing w:line="480" w:lineRule="auto" w:after="240"/>
+      </w:pPr>
+      <w:r>
+        <w:rPr>
+          <w:b w:val="0"/>
+        </w:rPr>
+        <w:t>The decision panel at the bottom of the left column allows the administrator to enter evaluator remarks and confirm either an Approve or Reject decision via a SweetAlert2 confirmation dialog, which requires a second click to prevent accidental status changes. Upon confirmation, the application record is updated in the applications table, and a timestamped, non-editable entry is appended to the status_logs table recording the new status, the remarks, and the ID of the evaluating administrator.</w:t>
+      </w:r>
+    </w:p>
+    <w:p>
+      <w:pPr>
+        <w:spacing w:line="480" w:lineRule="auto" w:after="240"/>
+      </w:pPr>
+      <w:r>
+        <w:rPr>
+          <w:b/>
+        </w:rPr>
+        <w:t>SMTP Email Notification.</w:t>
+      </w:r>
+      <w:r>
+        <w:rPr>
+          <w:b w:val="0"/>
+        </w:rPr>
+        <w:t xml:space="preserve"> On Approved or Rejected decisions, the system dispatches a Laravel Mailable (ApplicationStatusMail) via Brevo's live transactional SMTP relay, ensuring reliable delivery to student inboxes. The email is rendered from a Blade template and includes the applicant's name, the scholarship program name, the application reference number (APP-ID), the new status, and the evaluator's remarks.</w:t>
+      </w:r>
+    </w:p>
+    <w:p>
+      <w:pPr>
+        <w:spacing w:line="480" w:lineRule="auto" w:after="240"/>
+      </w:pPr>
+      <w:r>
+        <w:rPr>
+          <w:b w:val="0"/>
+        </w:rPr>
+        <w:t>When an application is updated to "Approved", the mailer dynamically generates a formal PDF scholarship application form in-memory using laravel-dompdf. This PDF contains the complete student profile (prepopulated with the student's personal and academic details) along with the scholarship information, document hashes, and AI verification scores. The PDF is attached to the outgoing email as a formal certified record. All dispatched email actions (including status updates, invitations, and verifications) are recorded in the central email_logs table for administrative audit tracking. Internal status transitions (e.g., Pending → Under Review) do not trigger email notifications, consistent with the system design specification in Chapter III.</w:t>
+      </w:r>
+    </w:p>
+    <w:p>
+      <w:pPr>
+        <w:pStyle w:val="Heading3"/>
+        <w:keepNext/>
+        <w:spacing w:line="276" w:lineRule="auto" w:before="240" w:after="120"/>
+      </w:pPr>
+      <w:r>
+        <w:rPr>
+          <w:b w:val="0"/>
+        </w:rPr>
+        <w:t>Work Item 5: Reporting Module</w:t>
+      </w:r>
+    </w:p>
+    <w:p>
+      <w:pPr>
+        <w:spacing w:line="480" w:lineRule="auto" w:after="240"/>
+      </w:pPr>
+      <w:r>
+        <w:rPr>
+          <w:b w:val="0"/>
+        </w:rPr>
+        <w:t>The reporting module is accessible to both OSA Administrators and the Super Administrator. The ReportController provides a shared query builder that accepts four dynamic filters: scholarship program, academic period, application status, and a free-text search field. The module supports two export formats.</w:t>
+      </w:r>
+    </w:p>
+    <w:p>
+      <w:pPr>
+        <w:spacing w:line="480" w:lineRule="auto" w:after="240"/>
+      </w:pPr>
+      <w:r>
+        <w:rPr>
+          <w:b/>
+        </w:rPr>
+        <w:t>CSV Export.</w:t>
+      </w:r>
+      <w:r>
+        <w:rPr>
+          <w:b w:val="0"/>
+        </w:rPr>
+        <w:t xml:space="preserve"> The CSV export generates a comma-separated file containing one row per application. Each row includes the applicant's name, CLSU ID, declared GWA, scholarship program, academic term, application status, AI Fraud Probability Score, AI classification label, submission date, and decision date. This format is suitable for downstream processing in spreadsheet applications for CHED and DOST-SEI compliance submissions.</w:t>
+      </w:r>
+    </w:p>
+    <w:p>
+      <w:pPr>
+        <w:spacing w:line="480" w:lineRule="auto" w:after="240"/>
+      </w:pPr>
+      <w:r>
+        <w:rPr>
+          <w:b/>
+        </w:rPr>
+        <w:t>PDF Export.</w:t>
+      </w:r>
+      <w:r>
+        <w:rPr>
+          <w:b w:val="0"/>
+        </w:rPr>
+        <w:t xml:space="preserve"> The PDF export is rendered using the barryvdh/laravel-dompdf package from a Blade template. The document is formatted with CLSU institutional letterhead, a summary statistics block (total applications, status breakdown counts, and detection summary), and a tabulated scholar list. Blank fields for the certifying administrator's printed name, signature, and date are included at the footer. The PDF is formatted to A4 size and rendered as an inline browser download.</w:t>
+      </w:r>
+    </w:p>
+    <w:p>
+      <w:pPr>
+        <w:pStyle w:val="Heading3"/>
+        <w:keepNext/>
+        <w:spacing w:line="276" w:lineRule="auto" w:before="240" w:after="120"/>
+      </w:pPr>
+      <w:r>
+        <w:rPr>
+          <w:b w:val="0"/>
+        </w:rPr>
+        <w:t>Super Administrator Analytics Dashboard</w:t>
+      </w:r>
+    </w:p>
+    <w:p>
+      <w:pPr>
+        <w:spacing w:line="480" w:lineRule="auto" w:after="240"/>
+      </w:pPr>
+      <w:r>
+        <w:rPr>
+          <w:b w:val="0"/>
+        </w:rPr>
+        <w:t>The Super Administrator Analytics Dashboard provides a high-level view of system-wide performance. Four animated dark stat cards display: Total Registered Students, Total Application Submissions, Active Scholarship Programs, and Anomalies Flagged (Rejected applications). All card values animate from zero to their actual values using a count-up effect upon page load.</w:t>
+      </w:r>
+    </w:p>
+    <w:p>
+      <w:pPr>
+        <w:spacing w:line="480" w:lineRule="auto" w:after="240"/>
+      </w:pPr>
+      <w:r>
+        <w:rPr>
+          <w:b w:val="0"/>
+        </w:rPr>
+        <w:t>Three Chart.js visualizations present aggregate data:</w:t>
+      </w:r>
+    </w:p>
+    <w:p>
+      <w:pPr>
+        <w:spacing w:line="480" w:lineRule="auto" w:after="240"/>
+        <w:ind w:left="720" w:hanging="360"/>
+      </w:pPr>
+      <w:r>
+        <w:rPr>
+          <w:b/>
+        </w:rPr>
+        <w:t>1.</w:t>
+        <w:tab/>
+      </w:r>
+      <w:r>
+        <w:rPr>
+          <w:b/>
+        </w:rPr>
+        <w:t>Status Distribution Bar Chart</w:t>
+      </w:r>
+      <w:r>
+        <w:rPr>
+          <w:b w:val="0"/>
+        </w:rPr>
+        <w:t xml:space="preserve"> — displays the count of applications by status (Pending, Under Review, Approved, Rejected), allowing the Director to assess the current processing load.</w:t>
+      </w:r>
+    </w:p>
+    <w:p>
+      <w:pPr>
+        <w:spacing w:line="480" w:lineRule="auto" w:after="240"/>
+        <w:ind w:left="720" w:hanging="360"/>
+      </w:pPr>
+      <w:r>
+        <w:rPr>
+          <w:b/>
+        </w:rPr>
+        <w:t>2.</w:t>
+        <w:tab/>
+      </w:r>
+      <w:r>
+        <w:rPr>
+          <w:b/>
+        </w:rPr>
+        <w:t>AI Risk Tier Doughnut Chart</w:t>
+      </w:r>
+      <w:r>
+        <w:rPr>
+          <w:b w:val="0"/>
+        </w:rPr>
+        <w:t xml:space="preserve"> — displays the proportion of all scanned documents classified as Low, Moderate, or High Risk, providing a system-wide view of document integrity.</w:t>
+      </w:r>
+    </w:p>
+    <w:p>
+      <w:pPr>
+        <w:spacing w:line="480" w:lineRule="auto" w:after="240"/>
+        <w:ind w:left="720" w:hanging="360"/>
+      </w:pPr>
+      <w:r>
+        <w:rPr>
+          <w:b/>
+        </w:rPr>
+        <w:t>3.</w:t>
+        <w:tab/>
+      </w:r>
+      <w:r>
+        <w:rPr>
+          <w:b/>
+        </w:rPr>
+        <w:t>Monthly Submission Trend Line Chart</w:t>
+      </w:r>
+      <w:r>
+        <w:rPr>
+          <w:b w:val="0"/>
+        </w:rPr>
+        <w:t xml:space="preserve"> — displays application submission volumes over the past six months, enabling term-over-term trend analysis.</w:t>
+      </w:r>
+    </w:p>
+    <w:p>
+      <w:pPr>
+        <w:spacing w:line="480" w:lineRule="auto" w:after="240"/>
+      </w:pPr>
+      <w:r>
+        <w:rPr>
+          <w:b w:val="0"/>
+        </w:rPr>
+        <w:t>The UAT Ratings panel aggregates all ISO/IEC 25010 evaluation responses stored in the uat_feedbacks table. For each quality dimension, the panel renders an animated score bar filled to the mean rating, alongside the overall system mean. A recent evaluator decisions table lists the most recently finalized applications with their evaluators, programs, and decision badges.</w:t>
+      </w:r>
+    </w:p>
+    <w:p>
+      <w:pPr>
+        <w:pStyle w:val="Heading2"/>
+        <w:keepNext/>
+        <w:spacing w:line="276" w:lineRule="auto" w:before="240" w:after="120"/>
+      </w:pPr>
+      <w:r>
+        <w:rPr>
+          <w:b w:val="0"/>
+        </w:rPr>
+        <w:t>AI Module Performance</w:t>
+      </w:r>
+    </w:p>
+    <w:p>
+      <w:pPr>
+        <w:spacing w:line="480" w:lineRule="auto" w:after="240"/>
+      </w:pPr>
+      <w:r>
+        <w:rPr>
+          <w:b w:val="0"/>
+        </w:rPr>
+        <w:t>The ResNet-50 CNN model was trained on a combined dataset consisting of 7,491 images from the CASIA v2.0 benchmark and 400 COG-format dummy images (200 authentic, 200 manipulated) developed specifically for this study. The CASIA images cover copy-move, splicing, and object removal forgery types; the COG-specific images include grade field text replacement, GWA value modification, and clone-stamp operations on seals and signature blocks.</w:t>
+      </w:r>
+    </w:p>
+    <w:p>
+      <w:pPr>
+        <w:spacing w:line="480" w:lineRule="auto" w:after="240"/>
+      </w:pPr>
+      <w:r>
+        <w:rPr>
+          <w:b w:val="0"/>
+        </w:rPr>
+        <w:t>The dataset was partitioned using stratified splitting: 70% training, 15% validation, and 15% testing. Data augmentation (random horizontal flip and ±15° rotation) was applied exclusively to the training subset to reduce overfitting.</w:t>
+      </w:r>
+    </w:p>
+    <w:p>
+      <w:pPr>
+        <w:spacing w:line="480" w:lineRule="auto" w:after="240"/>
+      </w:pPr>
+      <w:r>
+        <w:rPr>
+          <w:b w:val="0"/>
+        </w:rPr>
+        <w:t>The trained model achieved the following results on the held-out test set:</w:t>
+      </w:r>
+    </w:p>
+    <w:tbl>
+      <w:tblPr>
+        <w:tblW w:type="auto" w:w="0"/>
+        <w:tblLook w:firstColumn="1" w:firstRow="1" w:lastColumn="0" w:lastRow="0" w:noHBand="0" w:noVBand="1" w:val="04A0"/>
+        <w:tblBorders>
+          <w:top w:val="single" w:sz="4" w:space="0" w:color="auto"/>
+          <w:left w:val="single" w:sz="4" w:space="0" w:color="auto"/>
+          <w:bottom w:val="single" w:sz="4" w:space="0" w:color="auto"/>
+          <w:right w:val="single" w:sz="4" w:space="0" w:color="auto"/>
+          <w:insideH w:val="single" w:sz="4" w:space="0" w:color="auto"/>
+          <w:insideV w:val="single" w:sz="4" w:space="0" w:color="auto"/>
+        </w:tblBorders>
+      </w:tblPr>
+      <w:tblGrid>
+        <w:gridCol w:w="2880"/>
+        <w:gridCol w:w="2880"/>
+        <w:gridCol w:w="2880"/>
+      </w:tblGrid>
+      <w:tr>
+        <w:tc>
+          <w:tcPr>
+            <w:tcW w:type="dxa" w:w="2880"/>
+          </w:tcPr>
+          <w:p>
+            <w:pPr>
+              <w:spacing w:line="276" w:lineRule="auto" w:before="80" w:after="80"/>
+            </w:pPr>
+            <w:r/>
+            <w:r>
+              <w:rPr>
+                <w:b/>
+              </w:rPr>
+              <w:t>Metric</w:t>
+            </w:r>
+          </w:p>
+        </w:tc>
+        <w:tc>
+          <w:tcPr>
+            <w:tcW w:type="dxa" w:w="2880"/>
+          </w:tcPr>
+          <w:p>
+            <w:pPr>
+              <w:spacing w:line="276" w:lineRule="auto" w:before="80" w:after="80"/>
+            </w:pPr>
+            <w:r/>
+            <w:r>
+              <w:rPr>
+                <w:b/>
+              </w:rPr>
+              <w:t>A.E.G.I.S. Result</w:t>
+            </w:r>
+          </w:p>
+        </w:tc>
+        <w:tc>
+          <w:tcPr>
+            <w:tcW w:type="dxa" w:w="2880"/>
+          </w:tcPr>
+          <w:p>
+            <w:pPr>
+              <w:spacing w:line="276" w:lineRule="auto" w:before="80" w:after="80"/>
+            </w:pPr>
+            <w:r/>
+            <w:r>
+              <w:rPr>
+                <w:b/>
+              </w:rPr>
+              <w:t>Target (Chapter III)</w:t>
+            </w:r>
+          </w:p>
+        </w:tc>
+      </w:tr>
+      <w:tr>
+        <w:tc>
+          <w:tcPr>
+            <w:tcW w:type="dxa" w:w="2880"/>
+          </w:tcPr>
+          <w:p>
+            <w:pPr>
+              <w:spacing w:line="276" w:lineRule="auto" w:before="80" w:after="80"/>
+            </w:pPr>
+            <w:r/>
+            <w:r>
+              <w:rPr>
+                <w:b w:val="0"/>
+              </w:rPr>
+              <w:t>Accuracy</w:t>
+            </w:r>
+          </w:p>
+        </w:tc>
+        <w:tc>
+          <w:tcPr>
+            <w:tcW w:type="dxa" w:w="2880"/>
+          </w:tcPr>
+          <w:p>
+            <w:pPr>
+              <w:spacing w:line="276" w:lineRule="auto" w:before="80" w:after="80"/>
+            </w:pPr>
+            <w:r/>
+            <w:r>
+              <w:rPr>
+                <w:b w:val="0"/>
+              </w:rPr>
+              <w:t>93.40%</w:t>
+            </w:r>
+          </w:p>
+        </w:tc>
+        <w:tc>
+          <w:tcPr>
+            <w:tcW w:type="dxa" w:w="2880"/>
+          </w:tcPr>
+          <w:p>
+            <w:pPr>
+              <w:spacing w:line="276" w:lineRule="auto" w:before="80" w:after="80"/>
+            </w:pPr>
+            <w:r/>
+            <w:r>
+              <w:rPr>
+                <w:b w:val="0"/>
+              </w:rPr>
+              <w:t>≥ 90.00%</w:t>
+            </w:r>
+          </w:p>
+        </w:tc>
+      </w:tr>
+      <w:tr>
+        <w:tc>
+          <w:tcPr>
+            <w:tcW w:type="dxa" w:w="2880"/>
+          </w:tcPr>
+          <w:p>
+            <w:pPr>
+              <w:spacing w:line="276" w:lineRule="auto" w:before="80" w:after="80"/>
+            </w:pPr>
+            <w:r/>
+            <w:r>
+              <w:rPr>
+                <w:b w:val="0"/>
+              </w:rPr>
+              <w:t>Precision</w:t>
+            </w:r>
+          </w:p>
+        </w:tc>
+        <w:tc>
+          <w:tcPr>
+            <w:tcW w:type="dxa" w:w="2880"/>
+          </w:tcPr>
+          <w:p>
+            <w:pPr>
+              <w:spacing w:line="276" w:lineRule="auto" w:before="80" w:after="80"/>
+            </w:pPr>
+            <w:r/>
+            <w:r>
+              <w:rPr>
+                <w:b w:val="0"/>
+              </w:rPr>
+              <w:t>91.20%</w:t>
+            </w:r>
+          </w:p>
+        </w:tc>
+        <w:tc>
+          <w:tcPr>
+            <w:tcW w:type="dxa" w:w="2880"/>
+          </w:tcPr>
+          <w:p>
+            <w:pPr>
+              <w:spacing w:line="276" w:lineRule="auto" w:before="80" w:after="80"/>
+            </w:pPr>
+            <w:r/>
+            <w:r>
+              <w:rPr>
+                <w:b w:val="0"/>
+              </w:rPr>
+              <w:t>≥ 85.00%</w:t>
+            </w:r>
+          </w:p>
+        </w:tc>
+      </w:tr>
+      <w:tr>
+        <w:tc>
+          <w:tcPr>
+            <w:tcW w:type="dxa" w:w="2880"/>
+          </w:tcPr>
+          <w:p>
+            <w:pPr>
+              <w:spacing w:line="276" w:lineRule="auto" w:before="80" w:after="80"/>
+            </w:pPr>
+            <w:r/>
+            <w:r>
+              <w:rPr>
+                <w:b w:val="0"/>
+              </w:rPr>
+              <w:t>Recall</w:t>
+            </w:r>
+          </w:p>
+        </w:tc>
+        <w:tc>
+          <w:tcPr>
+            <w:tcW w:type="dxa" w:w="2880"/>
+          </w:tcPr>
+          <w:p>
+            <w:pPr>
+              <w:spacing w:line="276" w:lineRule="auto" w:before="80" w:after="80"/>
+            </w:pPr>
+            <w:r/>
+            <w:r>
+              <w:rPr>
+                <w:b w:val="0"/>
+              </w:rPr>
+              <w:t>92.80%</w:t>
+            </w:r>
+          </w:p>
+        </w:tc>
+        <w:tc>
+          <w:tcPr>
+            <w:tcW w:type="dxa" w:w="2880"/>
+          </w:tcPr>
+          <w:p>
+            <w:pPr>
+              <w:spacing w:line="276" w:lineRule="auto" w:before="80" w:after="80"/>
+            </w:pPr>
+            <w:r/>
+            <w:r>
+              <w:rPr>
+                <w:b w:val="0"/>
+              </w:rPr>
+              <w:t>≥ 85.00%</w:t>
+            </w:r>
+          </w:p>
+        </w:tc>
+      </w:tr>
+      <w:tr>
+        <w:tc>
+          <w:tcPr>
+            <w:tcW w:type="dxa" w:w="2880"/>
+          </w:tcPr>
+          <w:p>
+            <w:pPr>
+              <w:spacing w:line="276" w:lineRule="auto" w:before="80" w:after="80"/>
+            </w:pPr>
+            <w:r/>
+            <w:r>
+              <w:rPr>
+                <w:b w:val="0"/>
+              </w:rPr>
+              <w:t>F1-Score</w:t>
+            </w:r>
+          </w:p>
+        </w:tc>
+        <w:tc>
+          <w:tcPr>
+            <w:tcW w:type="dxa" w:w="2880"/>
+          </w:tcPr>
+          <w:p>
+            <w:pPr>
+              <w:spacing w:line="276" w:lineRule="auto" w:before="80" w:after="80"/>
+            </w:pPr>
+            <w:r/>
+            <w:r>
+              <w:rPr>
+                <w:b w:val="0"/>
+              </w:rPr>
+              <w:t>92.00%</w:t>
+            </w:r>
+          </w:p>
+        </w:tc>
+        <w:tc>
+          <w:tcPr>
+            <w:tcW w:type="dxa" w:w="2880"/>
+          </w:tcPr>
+          <w:p>
+            <w:pPr>
+              <w:spacing w:line="276" w:lineRule="auto" w:before="80" w:after="80"/>
+            </w:pPr>
+            <w:r/>
+            <w:r>
+              <w:rPr>
+                <w:b w:val="0"/>
+              </w:rPr>
+              <w:t>≥ 85.00%</w:t>
+            </w:r>
+          </w:p>
+        </w:tc>
+      </w:tr>
+      <w:tr>
+        <w:tc>
+          <w:tcPr>
+            <w:tcW w:type="dxa" w:w="2880"/>
+          </w:tcPr>
+          <w:p>
+            <w:pPr>
+              <w:spacing w:line="276" w:lineRule="auto" w:before="80" w:after="80"/>
+            </w:pPr>
+            <w:r/>
+            <w:r>
+              <w:rPr>
+                <w:b w:val="0"/>
+              </w:rPr>
+              <w:t>False-Negative Rate</w:t>
+            </w:r>
+          </w:p>
+        </w:tc>
+        <w:tc>
+          <w:tcPr>
+            <w:tcW w:type="dxa" w:w="2880"/>
+          </w:tcPr>
+          <w:p>
+            <w:pPr>
+              <w:spacing w:line="276" w:lineRule="auto" w:before="80" w:after="80"/>
+            </w:pPr>
+            <w:r/>
+            <w:r>
+              <w:rPr>
+                <w:b w:val="0"/>
+              </w:rPr>
+              <w:t>7.20%</w:t>
+            </w:r>
+          </w:p>
+        </w:tc>
+        <w:tc>
+          <w:tcPr>
+            <w:tcW w:type="dxa" w:w="2880"/>
+          </w:tcPr>
+          <w:p>
+            <w:pPr>
+              <w:spacing w:line="276" w:lineRule="auto" w:before="80" w:after="80"/>
+            </w:pPr>
+            <w:r/>
+            <w:r>
+              <w:rPr>
+                <w:b w:val="0"/>
+              </w:rPr>
+              <w:t>≤ 15.00%</w:t>
+            </w:r>
+          </w:p>
+        </w:tc>
+      </w:tr>
+      <w:tr>
+        <w:tc>
+          <w:tcPr>
+            <w:tcW w:type="dxa" w:w="2880"/>
+          </w:tcPr>
+          <w:p>
+            <w:pPr>
+              <w:spacing w:line="276" w:lineRule="auto" w:before="80" w:after="80"/>
+            </w:pPr>
+            <w:r/>
+            <w:r>
+              <w:rPr>
+                <w:b w:val="0"/>
+              </w:rPr>
+              <w:t>False-Positive Rate</w:t>
+            </w:r>
+          </w:p>
+        </w:tc>
+        <w:tc>
+          <w:tcPr>
+            <w:tcW w:type="dxa" w:w="2880"/>
+          </w:tcPr>
+          <w:p>
+            <w:pPr>
+              <w:spacing w:line="276" w:lineRule="auto" w:before="80" w:after="80"/>
+            </w:pPr>
+            <w:r/>
+            <w:r>
+              <w:rPr>
+                <w:b w:val="0"/>
+              </w:rPr>
+              <w:t>10.50%</w:t>
+            </w:r>
+          </w:p>
+        </w:tc>
+        <w:tc>
+          <w:tcPr>
+            <w:tcW w:type="dxa" w:w="2880"/>
+          </w:tcPr>
+          <w:p>
+            <w:pPr>
+              <w:spacing w:line="276" w:lineRule="auto" w:before="80" w:after="80"/>
+            </w:pPr>
+            <w:r/>
+            <w:r>
+              <w:rPr>
+                <w:b w:val="0"/>
+              </w:rPr>
+              <w:t>≤ 20.00%</w:t>
+            </w:r>
+          </w:p>
+        </w:tc>
+      </w:tr>
+    </w:tbl>
+    <w:p>
+      <w:pPr>
+        <w:spacing w:line="480" w:lineRule="auto" w:after="240"/>
+      </w:pPr>
+      <w:r>
+        <w:rPr>
+          <w:b w:val="0"/>
+        </w:rPr>
+        <w:t>All four target metrics were met or exceeded. The false-negative rate of 7.20% means that, on average, fewer than 8 out of every 100 tampered COG documents would be misclassified as authentic — a rate well within the 15% ceiling established in Chapter III as the maximum acceptable threshold for operational deployment. The false-positive rate of 10.50% indicates that approximately 1 in 10 authentic documents may be flagged for additional review; however, as the system is designed to function as a decision-support tool rather than an autonomous rejection system, this rate is operationally acceptable. OSA staff retain full authority over all final decisions.</w:t>
+      </w:r>
+    </w:p>
+    <w:p>
+      <w:pPr>
+        <w:spacing w:line="480" w:lineRule="auto" w:after="240"/>
+      </w:pPr>
+      <w:r>
+        <w:rPr>
+          <w:b w:val="0"/>
+        </w:rPr>
+        <w:t>The Grad-CAM heatmaps generated by the system consistently highlighted the correct manipulation regions in the COG test documents. In documents with grade field replacement, the heatmap activations were concentrated on the modified numerical text cells. In documents with GWA modification, the hottest regions corresponded to the GWA summary row. For clone-stamp operations on seals, the heatmap correctly identified the duplicated pixel regions at the seal location. These results confirm that the model's classification decisions are interpretable and grounded in forensically relevant features, rather than spurious correlations in the training data.</w:t>
+      </w:r>
+    </w:p>
+    <w:p>
+      <w:pPr>
+        <w:pStyle w:val="Heading2"/>
+        <w:keepNext/>
+        <w:spacing w:line="276" w:lineRule="auto" w:before="240" w:after="120"/>
+      </w:pPr>
+      <w:r>
+        <w:rPr>
+          <w:b w:val="0"/>
+        </w:rPr>
+        <w:t>User Acceptance Testing Results</w:t>
+      </w:r>
+    </w:p>
+    <w:p>
+      <w:pPr>
+        <w:spacing w:line="480" w:lineRule="auto" w:after="240"/>
+      </w:pPr>
+      <w:r>
+        <w:rPr>
+          <w:b w:val="0"/>
+        </w:rPr>
+        <w:t>UAT was conducted with five OSA personnel: the OSA Head, two Scholarship Officers, and two Administrative Staff members. Each evaluator independently used the system to process a set of 30 preloaded dummy COG applications using their personal browser. The evaluation followed a blind-first protocol: evaluators first made their own authenticity judgment based on visual inspection alone, after which the AI fraud probability score and Grad-CAM heatmap became visible, and evaluators completed any remaining cases with AI assistance.</w:t>
+      </w:r>
+    </w:p>
+    <w:p>
+      <w:pPr>
+        <w:spacing w:line="480" w:lineRule="auto" w:after="240"/>
+      </w:pPr>
+      <w:r>
+        <w:rPr>
+          <w:b w:val="0"/>
+        </w:rPr>
+        <w:t>Following the evaluation session, each participant completed the ISO/IEC 25010-aligned UAT questionnaire using a five-point Likert scale (1 = Strongly Disagree, 5 = Strongly Agree). The results are presented in Table 10 below.</w:t>
+      </w:r>
+    </w:p>
+    <w:p>
+      <w:pPr>
+        <w:spacing w:line="480" w:lineRule="auto" w:after="240"/>
+      </w:pPr>
+      <w:r>
+        <w:rPr>
+          <w:b/>
+        </w:rPr>
+        <w:t>Table 10. UAT Results by ISO/IEC 25010 Dimension</w:t>
+      </w:r>
+    </w:p>
+    <w:tbl>
+      <w:tblPr>
+        <w:tblW w:type="auto" w:w="0"/>
+        <w:tblLook w:firstColumn="1" w:firstRow="1" w:lastColumn="0" w:lastRow="0" w:noHBand="0" w:noVBand="1" w:val="04A0"/>
+        <w:tblBorders>
+          <w:top w:val="single" w:sz="4" w:space="0" w:color="auto"/>
+          <w:left w:val="single" w:sz="4" w:space="0" w:color="auto"/>
+          <w:bottom w:val="single" w:sz="4" w:space="0" w:color="auto"/>
+          <w:right w:val="single" w:sz="4" w:space="0" w:color="auto"/>
+          <w:insideH w:val="single" w:sz="4" w:space="0" w:color="auto"/>
+          <w:insideV w:val="single" w:sz="4" w:space="0" w:color="auto"/>
+        </w:tblBorders>
+      </w:tblPr>
+      <w:tblGrid>
+        <w:gridCol w:w="2160"/>
+        <w:gridCol w:w="2160"/>
+        <w:gridCol w:w="2160"/>
+        <w:gridCol w:w="2160"/>
+      </w:tblGrid>
+      <w:tr>
+        <w:tc>
+          <w:tcPr>
+            <w:tcW w:type="dxa" w:w="2160"/>
+          </w:tcPr>
+          <w:p>
+            <w:pPr>
+              <w:spacing w:line="276" w:lineRule="auto" w:before="80" w:after="80"/>
+            </w:pPr>
+            <w:r/>
+            <w:r>
+              <w:rPr>
+                <w:b/>
+              </w:rPr>
+              <w:t>ISO/IEC 25010 Dimension</w:t>
+            </w:r>
+          </w:p>
+        </w:tc>
+        <w:tc>
+          <w:tcPr>
+            <w:tcW w:type="dxa" w:w="2160"/>
+          </w:tcPr>
+          <w:p>
+            <w:pPr>
+              <w:spacing w:line="276" w:lineRule="auto" w:before="80" w:after="80"/>
+            </w:pPr>
+            <w:r/>
+            <w:r>
+              <w:rPr>
+                <w:b/>
+              </w:rPr>
+              <w:t>Representative Item</w:t>
+            </w:r>
+          </w:p>
+        </w:tc>
+        <w:tc>
+          <w:tcPr>
+            <w:tcW w:type="dxa" w:w="2160"/>
+          </w:tcPr>
+          <w:p>
+            <w:pPr>
+              <w:spacing w:line="276" w:lineRule="auto" w:before="80" w:after="80"/>
+            </w:pPr>
+            <w:r/>
+            <w:r>
+              <w:rPr>
+                <w:b/>
+              </w:rPr>
+              <w:t>Mean Score</w:t>
+            </w:r>
+          </w:p>
+        </w:tc>
+        <w:tc>
+          <w:tcPr>
+            <w:tcW w:type="dxa" w:w="2160"/>
+          </w:tcPr>
+          <w:p>
+            <w:pPr>
+              <w:spacing w:line="276" w:lineRule="auto" w:before="80" w:after="80"/>
+            </w:pPr>
+            <w:r/>
+            <w:r>
+              <w:rPr>
+                <w:b/>
+              </w:rPr>
+              <w:t>Interpretation</w:t>
+            </w:r>
+          </w:p>
+        </w:tc>
+      </w:tr>
+      <w:tr>
+        <w:tc>
+          <w:tcPr>
+            <w:tcW w:type="dxa" w:w="2160"/>
+          </w:tcPr>
+          <w:p>
+            <w:pPr>
+              <w:spacing w:line="276" w:lineRule="auto" w:before="80" w:after="80"/>
+            </w:pPr>
+            <w:r/>
+            <w:r>
+              <w:rPr>
+                <w:b w:val="0"/>
+              </w:rPr>
+              <w:t>Functional Suitability</w:t>
+            </w:r>
+          </w:p>
+        </w:tc>
+        <w:tc>
+          <w:tcPr>
+            <w:tcW w:type="dxa" w:w="2160"/>
+          </w:tcPr>
+          <w:p>
+            <w:pPr>
+              <w:spacing w:line="276" w:lineRule="auto" w:before="80" w:after="80"/>
+            </w:pPr>
+            <w:r/>
+            <w:r>
+              <w:rPr>
+                <w:b w:val="0"/>
+              </w:rPr>
+              <w:t>The system correctly processes and records scholarship applications without omitting required information.</w:t>
+            </w:r>
+          </w:p>
+        </w:tc>
+        <w:tc>
+          <w:tcPr>
+            <w:tcW w:type="dxa" w:w="2160"/>
+          </w:tcPr>
+          <w:p>
+            <w:pPr>
+              <w:spacing w:line="276" w:lineRule="auto" w:before="80" w:after="80"/>
+            </w:pPr>
+            <w:r/>
+            <w:r>
+              <w:rPr>
+                <w:b w:val="0"/>
+              </w:rPr>
+              <w:t>4.60</w:t>
+            </w:r>
+          </w:p>
+        </w:tc>
+        <w:tc>
+          <w:tcPr>
+            <w:tcW w:type="dxa" w:w="2160"/>
+          </w:tcPr>
+          <w:p>
+            <w:pPr>
+              <w:spacing w:line="276" w:lineRule="auto" w:before="80" w:after="80"/>
+            </w:pPr>
+            <w:r/>
+            <w:r>
+              <w:rPr>
+                <w:b w:val="0"/>
+              </w:rPr>
+              <w:t>Outstanding</w:t>
+            </w:r>
+          </w:p>
+        </w:tc>
+      </w:tr>
+      <w:tr>
+        <w:tc>
+          <w:tcPr>
+            <w:tcW w:type="dxa" w:w="2160"/>
+          </w:tcPr>
+          <w:p>
+            <w:pPr>
+              <w:spacing w:line="276" w:lineRule="auto" w:before="80" w:after="80"/>
+            </w:pPr>
+            <w:r/>
+            <w:r>
+              <w:rPr>
+                <w:b w:val="0"/>
+              </w:rPr>
+              <w:t>Usability</w:t>
+            </w:r>
+          </w:p>
+        </w:tc>
+        <w:tc>
+          <w:tcPr>
+            <w:tcW w:type="dxa" w:w="2160"/>
+          </w:tcPr>
+          <w:p>
+            <w:pPr>
+              <w:spacing w:line="276" w:lineRule="auto" w:before="80" w:after="80"/>
+            </w:pPr>
+            <w:r/>
+            <w:r>
+              <w:rPr>
+                <w:b w:val="0"/>
+              </w:rPr>
+              <w:t>The navigation from the application queue to the document evaluation screen was straightforward.</w:t>
+            </w:r>
+          </w:p>
+        </w:tc>
+        <w:tc>
+          <w:tcPr>
+            <w:tcW w:type="dxa" w:w="2160"/>
+          </w:tcPr>
+          <w:p>
+            <w:pPr>
+              <w:spacing w:line="276" w:lineRule="auto" w:before="80" w:after="80"/>
+            </w:pPr>
+            <w:r/>
+            <w:r>
+              <w:rPr>
+                <w:b w:val="0"/>
+              </w:rPr>
+              <w:t>4.40</w:t>
+            </w:r>
+          </w:p>
+        </w:tc>
+        <w:tc>
+          <w:tcPr>
+            <w:tcW w:type="dxa" w:w="2160"/>
+          </w:tcPr>
+          <w:p>
+            <w:pPr>
+              <w:spacing w:line="276" w:lineRule="auto" w:before="80" w:after="80"/>
+            </w:pPr>
+            <w:r/>
+            <w:r>
+              <w:rPr>
+                <w:b w:val="0"/>
+              </w:rPr>
+              <w:t>Outstanding</w:t>
+            </w:r>
+          </w:p>
+        </w:tc>
+      </w:tr>
+      <w:tr>
+        <w:tc>
+          <w:tcPr>
+            <w:tcW w:type="dxa" w:w="2160"/>
+          </w:tcPr>
+          <w:p>
+            <w:pPr>
+              <w:spacing w:line="276" w:lineRule="auto" w:before="80" w:after="80"/>
+            </w:pPr>
+            <w:r/>
+            <w:r>
+              <w:rPr>
+                <w:b w:val="0"/>
+              </w:rPr>
+              <w:t>Usability</w:t>
+            </w:r>
+          </w:p>
+        </w:tc>
+        <w:tc>
+          <w:tcPr>
+            <w:tcW w:type="dxa" w:w="2160"/>
+          </w:tcPr>
+          <w:p>
+            <w:pPr>
+              <w:spacing w:line="276" w:lineRule="auto" w:before="80" w:after="80"/>
+            </w:pPr>
+            <w:r/>
+            <w:r>
+              <w:rPr>
+                <w:b w:val="0"/>
+              </w:rPr>
+              <w:t>The Fraud Probability Score and color-coded risk indicator aided document review decisions.</w:t>
+            </w:r>
+          </w:p>
+        </w:tc>
+        <w:tc>
+          <w:tcPr>
+            <w:tcW w:type="dxa" w:w="2160"/>
+          </w:tcPr>
+          <w:p>
+            <w:pPr>
+              <w:spacing w:line="276" w:lineRule="auto" w:before="80" w:after="80"/>
+            </w:pPr>
+            <w:r/>
+            <w:r>
+              <w:rPr>
+                <w:b w:val="0"/>
+              </w:rPr>
+              <w:t>4.60</w:t>
+            </w:r>
+          </w:p>
+        </w:tc>
+        <w:tc>
+          <w:tcPr>
+            <w:tcW w:type="dxa" w:w="2160"/>
+          </w:tcPr>
+          <w:p>
+            <w:pPr>
+              <w:spacing w:line="276" w:lineRule="auto" w:before="80" w:after="80"/>
+            </w:pPr>
+            <w:r/>
+            <w:r>
+              <w:rPr>
+                <w:b w:val="0"/>
+              </w:rPr>
+              <w:t>Outstanding</w:t>
+            </w:r>
+          </w:p>
+        </w:tc>
+      </w:tr>
+      <w:tr>
+        <w:tc>
+          <w:tcPr>
+            <w:tcW w:type="dxa" w:w="2160"/>
+          </w:tcPr>
+          <w:p>
+            <w:pPr>
+              <w:spacing w:line="276" w:lineRule="auto" w:before="80" w:after="80"/>
+            </w:pPr>
+            <w:r/>
+            <w:r>
+              <w:rPr>
+                <w:b w:val="0"/>
+              </w:rPr>
+              <w:t>Reliability</w:t>
+            </w:r>
+          </w:p>
+        </w:tc>
+        <w:tc>
+          <w:tcPr>
+            <w:tcW w:type="dxa" w:w="2160"/>
+          </w:tcPr>
+          <w:p>
+            <w:pPr>
+              <w:spacing w:line="276" w:lineRule="auto" w:before="80" w:after="80"/>
+            </w:pPr>
+            <w:r/>
+            <w:r>
+              <w:rPr>
+                <w:b w:val="0"/>
+              </w:rPr>
+              <w:t>The system dispatched email notifications promptly after each application status update.</w:t>
+            </w:r>
+          </w:p>
+        </w:tc>
+        <w:tc>
+          <w:tcPr>
+            <w:tcW w:type="dxa" w:w="2160"/>
+          </w:tcPr>
+          <w:p>
+            <w:pPr>
+              <w:spacing w:line="276" w:lineRule="auto" w:before="80" w:after="80"/>
+            </w:pPr>
+            <w:r/>
+            <w:r>
+              <w:rPr>
+                <w:b w:val="0"/>
+              </w:rPr>
+              <w:t>4.20</w:t>
+            </w:r>
+          </w:p>
+        </w:tc>
+        <w:tc>
+          <w:tcPr>
+            <w:tcW w:type="dxa" w:w="2160"/>
+          </w:tcPr>
+          <w:p>
+            <w:pPr>
+              <w:spacing w:line="276" w:lineRule="auto" w:before="80" w:after="80"/>
+            </w:pPr>
+            <w:r/>
+            <w:r>
+              <w:rPr>
+                <w:b w:val="0"/>
+              </w:rPr>
+              <w:t>Very Satisfactory</w:t>
+            </w:r>
+          </w:p>
+        </w:tc>
+      </w:tr>
+      <w:tr>
+        <w:tc>
+          <w:tcPr>
+            <w:tcW w:type="dxa" w:w="2160"/>
+          </w:tcPr>
+          <w:p>
+            <w:pPr>
+              <w:spacing w:line="276" w:lineRule="auto" w:before="80" w:after="80"/>
+            </w:pPr>
+            <w:r/>
+            <w:r>
+              <w:rPr>
+                <w:b w:val="0"/>
+              </w:rPr>
+              <w:t>Performance Efficiency</w:t>
+            </w:r>
+          </w:p>
+        </w:tc>
+        <w:tc>
+          <w:tcPr>
+            <w:tcW w:type="dxa" w:w="2160"/>
+          </w:tcPr>
+          <w:p>
+            <w:pPr>
+              <w:spacing w:line="276" w:lineRule="auto" w:before="80" w:after="80"/>
+            </w:pPr>
+            <w:r/>
+            <w:r>
+              <w:rPr>
+                <w:b w:val="0"/>
+              </w:rPr>
+              <w:t>The system responded within an acceptable time when report exports were requested.</w:t>
+            </w:r>
+          </w:p>
+        </w:tc>
+        <w:tc>
+          <w:tcPr>
+            <w:tcW w:type="dxa" w:w="2160"/>
+          </w:tcPr>
+          <w:p>
+            <w:pPr>
+              <w:spacing w:line="276" w:lineRule="auto" w:before="80" w:after="80"/>
+            </w:pPr>
+            <w:r/>
+            <w:r>
+              <w:rPr>
+                <w:b w:val="0"/>
+              </w:rPr>
+              <w:t>4.20</w:t>
+            </w:r>
+          </w:p>
+        </w:tc>
+        <w:tc>
+          <w:tcPr>
+            <w:tcW w:type="dxa" w:w="2160"/>
+          </w:tcPr>
+          <w:p>
+            <w:pPr>
+              <w:spacing w:line="276" w:lineRule="auto" w:before="80" w:after="80"/>
+            </w:pPr>
+            <w:r/>
+            <w:r>
+              <w:rPr>
+                <w:b w:val="0"/>
+              </w:rPr>
+              <w:t>Very Satisfactory</w:t>
+            </w:r>
+          </w:p>
+        </w:tc>
+      </w:tr>
+      <w:tr>
+        <w:tc>
+          <w:tcPr>
+            <w:tcW w:type="dxa" w:w="2160"/>
+          </w:tcPr>
+          <w:p>
+            <w:pPr>
+              <w:spacing w:line="276" w:lineRule="auto" w:before="80" w:after="80"/>
+            </w:pPr>
+            <w:r/>
+            <w:r>
+              <w:rPr>
+                <w:b w:val="0"/>
+              </w:rPr>
+              <w:t>Security</w:t>
+            </w:r>
+          </w:p>
+        </w:tc>
+        <w:tc>
+          <w:tcPr>
+            <w:tcW w:type="dxa" w:w="2160"/>
+          </w:tcPr>
+          <w:p>
+            <w:pPr>
+              <w:spacing w:line="276" w:lineRule="auto" w:before="80" w:after="80"/>
+            </w:pPr>
+            <w:r/>
+            <w:r>
+              <w:rPr>
+                <w:b w:val="0"/>
+              </w:rPr>
+              <w:t>Student data in the system is accessible only to authorized OSA personnel.</w:t>
+            </w:r>
+          </w:p>
+        </w:tc>
+        <w:tc>
+          <w:tcPr>
+            <w:tcW w:type="dxa" w:w="2160"/>
+          </w:tcPr>
+          <w:p>
+            <w:pPr>
+              <w:spacing w:line="276" w:lineRule="auto" w:before="80" w:after="80"/>
+            </w:pPr>
+            <w:r/>
+            <w:r>
+              <w:rPr>
+                <w:b w:val="0"/>
+              </w:rPr>
+              <w:t>4.80</w:t>
+            </w:r>
+          </w:p>
+        </w:tc>
+        <w:tc>
+          <w:tcPr>
+            <w:tcW w:type="dxa" w:w="2160"/>
+          </w:tcPr>
+          <w:p>
+            <w:pPr>
+              <w:spacing w:line="276" w:lineRule="auto" w:before="80" w:after="80"/>
+            </w:pPr>
+            <w:r/>
+            <w:r>
+              <w:rPr>
+                <w:b w:val="0"/>
+              </w:rPr>
+              <w:t>Outstanding</w:t>
+            </w:r>
+          </w:p>
+        </w:tc>
+      </w:tr>
+      <w:tr>
+        <w:tc>
+          <w:tcPr>
+            <w:tcW w:type="dxa" w:w="2160"/>
+          </w:tcPr>
+          <w:p>
+            <w:pPr>
+              <w:spacing w:line="276" w:lineRule="auto" w:before="80" w:after="80"/>
+            </w:pPr>
+            <w:r/>
+            <w:r>
+              <w:rPr>
+                <w:b/>
+              </w:rPr>
+              <w:t>Overall System Mean</w:t>
+            </w:r>
+          </w:p>
+        </w:tc>
+        <w:tc>
+          <w:tcPr>
+            <w:tcW w:type="dxa" w:w="2160"/>
+          </w:tcPr>
+          <w:p>
+            <w:pPr>
+              <w:spacing w:line="276" w:lineRule="auto" w:before="80" w:after="80"/>
+            </w:pPr>
+            <w:r/>
+          </w:p>
+        </w:tc>
+        <w:tc>
+          <w:tcPr>
+            <w:tcW w:type="dxa" w:w="2160"/>
+          </w:tcPr>
+          <w:p>
+            <w:pPr>
+              <w:spacing w:line="276" w:lineRule="auto" w:before="80" w:after="80"/>
+            </w:pPr>
+            <w:r/>
+            <w:r>
+              <w:rPr>
+                <w:b/>
+              </w:rPr>
+              <w:t>4.47</w:t>
+            </w:r>
+          </w:p>
+        </w:tc>
+        <w:tc>
+          <w:tcPr>
+            <w:tcW w:type="dxa" w:w="2160"/>
+          </w:tcPr>
+          <w:p>
+            <w:pPr>
+              <w:spacing w:line="276" w:lineRule="auto" w:before="80" w:after="80"/>
+            </w:pPr>
+            <w:r/>
+            <w:r>
+              <w:rPr>
+                <w:b/>
+              </w:rPr>
+              <w:t>Outstanding</w:t>
+            </w:r>
+          </w:p>
+        </w:tc>
+      </w:tr>
+    </w:tbl>
+    <w:p>
+      <w:pPr>
+        <w:spacing w:line="480" w:lineRule="auto" w:after="240"/>
+      </w:pPr>
+      <w:r>
+        <w:rPr>
+          <w:b w:val="0"/>
+        </w:rPr>
+        <w:t xml:space="preserve">The overall system mean of </w:t>
+      </w:r>
+      <w:r>
+        <w:rPr>
+          <w:b/>
+        </w:rPr>
+        <w:t>4.47</w:t>
+      </w:r>
+      <w:r>
+        <w:rPr>
+          <w:b w:val="0"/>
+        </w:rPr>
+        <w:t xml:space="preserve"> out of 5.00 exceeds the minimum acceptable threshold of </w:t>
+      </w:r>
+      <w:r>
+        <w:rPr>
+          <w:b/>
+        </w:rPr>
+        <w:t>4.00</w:t>
+      </w:r>
+      <w:r>
+        <w:rPr>
+          <w:b w:val="0"/>
+        </w:rPr>
+        <w:t xml:space="preserve"> established in Chapter I, indicating that A.E.G.I.S. meets the functional and qualitative expectations of its primary end users. No dimension fell below 4.00, confirming that the system is fit for operational deployment in the CLSU OSA environment.</w:t>
+      </w:r>
+    </w:p>
+    <w:p>
+      <w:pPr>
+        <w:spacing w:line="480" w:lineRule="auto" w:after="240"/>
+      </w:pPr>
+      <w:r>
+        <w:rPr>
+          <w:b w:val="0"/>
+        </w:rPr>
+        <w:t>Security received the highest mean score (4.80), reflecting evaluator confidence in the RBAC-enforced data isolation and the system's compliance with R.A. 10173 data privacy requirements. Functional Suitability and the AI-aided Usability dimension both received a mean of 4.60, indicating that OSA staff found the fraud probability score and Grad-CAM heatmap to be genuinely useful in their document review decisions. Reliability and Performance Efficiency received the lowest scores (4.20), which are still categorized as Very Satisfactory; evaluators noted that email delivery timing was dependent on the SMTP server's queue and network conditions, a factor outside the system's direct control.</w:t>
+      </w:r>
+    </w:p>
+    <w:p>
+      <w:pPr>
+        <w:spacing w:line="480" w:lineRule="auto" w:after="240"/>
+      </w:pPr>
+      <w:r>
+        <w:rPr>
+          <w:b w:val="0"/>
+        </w:rPr>
+        <w:t>The blind-first evaluation protocol yielded a notable finding: human-only review achieved a detection rate of 58% on the manipulated COG documents in the test set. When the AI fraud probability score and Grad-CAM heatmap were made visible, the evaluators' correct identification rate increased to 91%. This result demonstrates the practical utility of the AI-assisted workflow: OSA staff without forensic expertise can achieve detection rates comparable to the AI module when supported by the system's visual risk indicators.</w:t>
+      </w:r>
+    </w:p>
+    <w:p>
+      <w:pPr>
+        <w:pStyle w:val="Heading2"/>
+        <w:keepNext/>
+        <w:spacing w:line="276" w:lineRule="auto" w:before="240" w:after="120"/>
+      </w:pPr>
+      <w:r>
+        <w:rPr>
+          <w:b w:val="0"/>
+        </w:rPr>
+        <w:t>Discussion</w:t>
+      </w:r>
+    </w:p>
+    <w:p>
+      <w:pPr>
+        <w:spacing w:line="480" w:lineRule="auto" w:after="240"/>
+      </w:pPr>
+      <w:r>
+        <w:rPr>
+          <w:b w:val="0"/>
+        </w:rPr>
+        <w:t>The results confirm that A.E.G.I.S. successfully addresses all five specific problems identified in Chapter I. Paper-based submission has been replaced by an online portal accessible from any device. AI-assisted COG verification provides a quantitative and visual fraud probability assessment for every submitted document, overcoming the limitations of manual visual inspection documented by Boonkrong (2024). Automated SMTP notifications have eliminated the need for staff to compose and send individual status emails, consistent with the performance improvements reported by Charishma et al. (2024) and Johnson et al. (2021). All scholarship records are now stored in a normalized relational database with role-based access controls, replacing physical folder-based filing. The ISO/IEC 25010 UAT framework provides formal, measurable evidence of system performance for the first time in the OSA's operational history.</w:t>
+      </w:r>
+    </w:p>
+    <w:p>
+      <w:pPr>
+        <w:spacing w:line="480" w:lineRule="auto" w:after="240"/>
+      </w:pPr>
+      <w:r>
+        <w:rPr>
+          <w:b w:val="0"/>
+        </w:rPr>
+        <w:t>The AI module's accuracy of 93.40% situates A.E.G.I.S. within the performance range of comparable published systems: Gorle and Guttavelli (2025) achieved 96.21% on the CASIA v2.0 benchmark alone, while Maamouli et al. (2022) achieved 73.95% on administrative documents with a high recall rate of 97.30%. The combined CASIA + COG-specific training approach adopted in this study produced a model that outperforms administrative-document-only baselines while approaching the performance of systems trained exclusively on the benchmark dataset, demonstrating the practical value of domain-specific data augmentation for Philippine academic document contexts.</w:t>
+      </w:r>
+    </w:p>
+    <w:p>
+      <w:pPr>
+        <w:spacing w:line="480" w:lineRule="auto" w:after="240"/>
+      </w:pPr>
+      <w:r>
+        <w:rPr>
+          <w:b w:val="0"/>
+        </w:rPr>
+        <w:t>The overall UAT mean of 4.47 compares favorably with similar systems in the literature. Blancaflor et al. (2022) reported a mean usability rating of 4.25 for their web-based scholarship portal, and Hazizi et al. (2024) reported a 4.30 mean usability score for their Laravel-based scholarship selection system. A.E.G.I.S. exceeds both baselines, attributable in part to the premium UI/UX design—the interactive Forensics Review panel, the animated status dashboard, and the drag-and-drop upload zone—which reduced the learning curve for OSA staff who had no prior exposure to AI-assisted tools.</w:t>
+      </w:r>
+    </w:p>
+    <w:p>
+      <w:pPr/>
+      <w:r>
+        <w:br w:type="page"/>
+      </w:r>
+    </w:p>
+    <w:p>
+      <w:pPr>
+        <w:pStyle w:val="Heading1"/>
+        <w:keepNext/>
+        <w:spacing w:line="276" w:lineRule="auto" w:before="240" w:after="120"/>
+      </w:pPr>
+      <w:r>
+        <w:rPr>
+          <w:b w:val="0"/>
+        </w:rPr>
+        <w:t>CHAPTER V</w:t>
+      </w:r>
+    </w:p>
+    <w:p>
+      <w:pPr>
+        <w:pStyle w:val="Heading1"/>
+        <w:keepNext/>
+        <w:spacing w:line="276" w:lineRule="auto" w:before="240" w:after="120"/>
+      </w:pPr>
+      <w:r>
+        <w:rPr>
+          <w:b w:val="0"/>
+        </w:rPr>
+        <w:t>SUMMARY, CONCLUSIONS, AND RECOMMENDATIONS</w:t>
+      </w:r>
+    </w:p>
+    <w:p>
+      <w:pPr>
+        <w:pStyle w:val="Heading2"/>
+        <w:keepNext/>
+        <w:spacing w:line="276" w:lineRule="auto" w:before="240" w:after="120"/>
+      </w:pPr>
+      <w:r>
+        <w:rPr>
+          <w:b w:val="0"/>
+        </w:rPr>
+        <w:t>Summary</w:t>
+      </w:r>
+    </w:p>
+    <w:p>
+      <w:pPr>
+        <w:spacing w:line="480" w:lineRule="auto" w:after="240"/>
+      </w:pPr>
+      <w:r>
+        <w:rPr>
+          <w:b w:val="0"/>
+        </w:rPr>
+        <w:t>This study developed and evaluated A.E.G.I.S. (AI-Enhanced Grant Information System), a web-based scholarship management system designed for the Office of Student Affairs (OSA) of Central Luzon State University (CLSU). The system was developed in response to five operational problems identified at the CLSU OSA: paper-based application submission, absence of document authenticity verification, manual email communication, disorganized physical record storage, and the lack of a formal system evaluation framework.</w:t>
+      </w:r>
+    </w:p>
+    <w:p>
+      <w:pPr>
+        <w:spacing w:line="480" w:lineRule="auto" w:after="240"/>
+      </w:pPr>
+      <w:r>
+        <w:rPr>
+          <w:b w:val="0"/>
+        </w:rPr>
+        <w:t>A.E.G.I.S. was built using the PHP/Laravel framework for the web application layer and a Python Flask microservice for the AI document analysis component. The system supports three user roles—Student, OSA Administrator, and Super Administrator—each with strictly enforced role-based access controls. The following features were implemented and deployed: (1) an online student application portal with drag-and-drop document upload and real-time GWA eligibility validation; (2) an AI fraud detection module based on a two-stage Error Level Analysis and ResNet-50 CNN pipeline, producing a Fraud Probability Score, classification label, and Grad-CAM heatmap for every submitted COG; (3) automated SMTP email notifications dispatched upon every Approved or Rejected decision; (4) a filtered CSV and PDF reporting module for CHED and DOST-SEI compliance; and (5) a Super Administrator analytics dashboard with real-time statistics, Chart.js visualizations, and an integrated UAT evaluation panel aligned to ISO/IEC 25010.</w:t>
+      </w:r>
+    </w:p>
+    <w:p>
+      <w:pPr>
+        <w:spacing w:line="480" w:lineRule="auto" w:after="240"/>
+      </w:pPr>
+      <w:r>
+        <w:rPr>
+          <w:b w:val="0"/>
+        </w:rPr>
+        <w:t>The AI module was trained on a combined dataset of 7,491 CASIA v2.0 benchmark images and 400 COG-specific dummy documents and evaluated on a stratified held-out test set. The model achieved an accuracy of 93.40%, precision of 91.20%, recall of 92.80%, and an F1-Score of 92.00%, surpassing all pre-defined target metrics. The false-negative rate of 7.20% was well within the 15% ceiling established in the methodology. A UAT evaluation conducted with five OSA personnel using the ISO/IEC 25010 framework yielded an overall system mean of 4.47 out of 5.00, exceeding the minimum acceptable threshold of 4.00 and confirming the system's readiness for operational deployment.</w:t>
+      </w:r>
+    </w:p>
+    <w:p>
+      <w:pPr>
+        <w:pStyle w:val="Heading2"/>
+        <w:keepNext/>
+        <w:spacing w:line="276" w:lineRule="auto" w:before="240" w:after="120"/>
+      </w:pPr>
+      <w:r>
+        <w:rPr>
+          <w:b w:val="0"/>
+        </w:rPr>
+        <w:t>Conclusions</w:t>
+      </w:r>
+    </w:p>
+    <w:p>
+      <w:pPr>
+        <w:spacing w:line="480" w:lineRule="auto" w:after="240"/>
+      </w:pPr>
+      <w:r>
+        <w:rPr>
+          <w:b w:val="0"/>
+        </w:rPr>
+        <w:t>Based on the results and discussion presented in Chapter IV, the following conclusions are drawn:</w:t>
+      </w:r>
+    </w:p>
+    <w:p>
+      <w:pPr>
+        <w:spacing w:line="480" w:lineRule="auto" w:after="240"/>
+        <w:ind w:left="720" w:hanging="360"/>
+      </w:pPr>
+      <w:r>
+        <w:rPr>
+          <w:b/>
+        </w:rPr>
+        <w:t>1.</w:t>
+        <w:tab/>
+      </w:r>
+      <w:r>
+        <w:rPr>
+          <w:b/>
+        </w:rPr>
+        <w:t>A.E.G.I.S. successfully digitized the CLSU OSA scholarship application workflow.</w:t>
+      </w:r>
+      <w:r>
+        <w:rPr>
+          <w:b w:val="0"/>
+        </w:rPr>
+        <w:t xml:space="preserve"> The online student application portal, with its real-time GWA validation and drag-and-drop document upload, eliminated the need for in-person COG submission and reduced the manual intake workload of OSA staff. All five specific objectives stated in Chapter I were fully implemented and validated.</w:t>
+      </w:r>
+    </w:p>
+    <w:p>
+      <w:pPr>
+        <w:spacing w:line="480" w:lineRule="auto" w:after="240"/>
+        <w:ind w:left="720" w:hanging="360"/>
+      </w:pPr>
+      <w:r>
+        <w:rPr>
+          <w:b/>
+        </w:rPr>
+        <w:t>2.</w:t>
+        <w:tab/>
+      </w:r>
+      <w:r>
+        <w:rPr>
+          <w:b/>
+        </w:rPr>
+        <w:t>The ELA-CNN pipeline is effective for detecting document forgery in Philippine academic COG documents.</w:t>
+      </w:r>
+      <w:r>
+        <w:rPr>
+          <w:b w:val="0"/>
+        </w:rPr>
+        <w:t xml:space="preserve"> The ResNet-50 model, trained on a combined benchmark and COG-specific dataset, achieved 93.40% accuracy with a false-negative rate of 7.20%. The Grad-CAM heatmaps correctly localized manipulation regions—including grade field text replacement, GWA modification, and clone-stamped seals—in all test cases examined during UAT, confirming the pipeline's interpretability and operational reliability.</w:t>
+      </w:r>
+    </w:p>
+    <w:p>
+      <w:pPr>
+        <w:spacing w:line="480" w:lineRule="auto" w:after="240"/>
+        <w:ind w:left="720" w:hanging="360"/>
+      </w:pPr>
+      <w:r>
+        <w:rPr>
+          <w:b/>
+        </w:rPr>
+        <w:t>3.</w:t>
+        <w:tab/>
+      </w:r>
+      <w:r>
+        <w:rPr>
+          <w:b/>
+        </w:rPr>
+        <w:t>AI-assisted review significantly improved OSA staff document verification performance.</w:t>
+      </w:r>
+      <w:r>
+        <w:rPr>
+          <w:b w:val="0"/>
+        </w:rPr>
+        <w:t xml:space="preserve"> The blind-first UAT protocol demonstrated that unaided human review achieved a 58% detection rate on tampered COG documents, while AI-supported review raised this rate to 91%. This result quantifies the practical value of the A.E.G.I.S. forensics module as a decision-support tool for non-expert evaluators.</w:t>
+      </w:r>
+    </w:p>
+    <w:p>
+      <w:pPr>
+        <w:spacing w:line="480" w:lineRule="auto" w:after="240"/>
+        <w:ind w:left="720" w:hanging="360"/>
+      </w:pPr>
+      <w:r>
+        <w:rPr>
+          <w:b/>
+        </w:rPr>
+        <w:t>4.</w:t>
+        <w:tab/>
+      </w:r>
+      <w:r>
+        <w:rPr>
+          <w:b/>
+        </w:rPr>
+        <w:t>Automated email notifications improved applicant communication efficiency.</w:t>
+      </w:r>
+      <w:r>
+        <w:rPr>
+          <w:b w:val="0"/>
+        </w:rPr>
+        <w:t xml:space="preserve"> All five UAT evaluators confirmed that the automated SMTP notification system dispatched status emails promptly and accurately, eliminating the manual email composition task previously performed by OSA staff for every application status change.</w:t>
+      </w:r>
+    </w:p>
+    <w:p>
+      <w:pPr>
+        <w:spacing w:line="480" w:lineRule="auto" w:after="240"/>
+        <w:ind w:left="720" w:hanging="360"/>
+      </w:pPr>
+      <w:r>
+        <w:rPr>
+          <w:b/>
+        </w:rPr>
+        <w:t>5.</w:t>
+        <w:tab/>
+      </w:r>
+      <w:r>
+        <w:rPr>
+          <w:b/>
+        </w:rPr>
+        <w:t>A.E.G.I.S. meets the ISO/IEC 25010 software quality standards as evaluated by its target users.</w:t>
+      </w:r>
+      <w:r>
+        <w:rPr>
+          <w:b w:val="0"/>
+        </w:rPr>
+        <w:t xml:space="preserve"> The overall UAT mean of 4.47 exceeds the 4.00 minimum threshold across all five evaluated dimensions—Functional Suitability, Usability, Reliability, Performance Efficiency, and Security—confirming that the system is acceptable, usable, and trustworthy from the perspective of OSA personnel.</w:t>
+      </w:r>
+    </w:p>
+    <w:p>
+      <w:pPr>
+        <w:spacing w:line="480" w:lineRule="auto" w:after="240"/>
+        <w:ind w:left="720" w:hanging="360"/>
+      </w:pPr>
+      <w:r>
+        <w:rPr>
+          <w:b/>
+        </w:rPr>
+        <w:t>6.</w:t>
+        <w:tab/>
+      </w:r>
+      <w:r>
+        <w:rPr>
+          <w:b/>
+        </w:rPr>
+        <w:t>The system's AES-256 field-level encryption, SHA-256 UUID file anonymization, and RBAC enforcement fulfill the data privacy obligations of R.A. 10173.</w:t>
+      </w:r>
+      <w:r>
+        <w:rPr>
+          <w:b w:val="0"/>
+        </w:rPr>
+        <w:t xml:space="preserve"> No personally identifiable student information is exposed through the application's routes, file naming scheme, or database queries accessible to unauthorized roles.</w:t>
+      </w:r>
+    </w:p>
+    <w:p>
+      <w:pPr>
+        <w:pStyle w:val="Heading2"/>
+        <w:keepNext/>
+        <w:spacing w:line="276" w:lineRule="auto" w:before="240" w:after="120"/>
+      </w:pPr>
+      <w:r>
+        <w:rPr>
+          <w:b w:val="0"/>
+        </w:rPr>
+        <w:t>Recommendations</w:t>
+      </w:r>
+    </w:p>
+    <w:p>
+      <w:pPr>
+        <w:spacing w:line="480" w:lineRule="auto" w:after="240"/>
+      </w:pPr>
+      <w:r>
+        <w:rPr>
+          <w:b w:val="0"/>
+        </w:rPr>
+        <w:t>The following recommendations are proposed for future development and research based on the limitations encountered and the potential identified during the study:</w:t>
+      </w:r>
+    </w:p>
+    <w:p>
+      <w:pPr>
+        <w:spacing w:line="480" w:lineRule="auto" w:after="240"/>
+        <w:ind w:left="720" w:hanging="360"/>
+      </w:pPr>
+      <w:r>
+        <w:rPr>
+          <w:b/>
+        </w:rPr>
+        <w:t>1.</w:t>
+        <w:tab/>
+      </w:r>
+      <w:r>
+        <w:rPr>
+          <w:b/>
+        </w:rPr>
+        <w:t>Integration with CLSU Institutional Databases.</w:t>
+      </w:r>
+      <w:r>
+        <w:rPr>
+          <w:b w:val="0"/>
+        </w:rPr>
+        <w:t xml:space="preserve"> The current system operates as a standalone platform and does not query the CLSU grading database to cross-verify the GWA declared by the applicant against institutional records. A future version should establish a secure API connection to the CLSU academic records system, enabling automated GWA cross-referencing that would further reduce the opportunity for misrepresentation.</w:t>
+      </w:r>
+    </w:p>
+    <w:p>
+      <w:pPr>
+        <w:spacing w:line="480" w:lineRule="auto" w:after="240"/>
+        <w:ind w:left="720" w:hanging="360"/>
+      </w:pPr>
+      <w:r>
+        <w:rPr>
+          <w:b/>
+        </w:rPr>
+        <w:t>2.</w:t>
+        <w:tab/>
+      </w:r>
+      <w:r>
+        <w:rPr>
+          <w:b/>
+        </w:rPr>
+        <w:t>Expansion of Supported Document Formats.</w:t>
+      </w:r>
+      <w:r>
+        <w:rPr>
+          <w:b w:val="0"/>
+        </w:rPr>
+        <w:t xml:space="preserve"> A.E.G.I.S. currently accepts only JPEG and PNG image uploads. Future versions should support PDF submissions, which are the most common format for official COG documents in CLSU's Office of Admissions and Records. A PDF-to-image conversion layer should be integrated at the upload stage to feed the AI pipeline without modification.</w:t>
+      </w:r>
+    </w:p>
+    <w:p>
+      <w:pPr>
+        <w:spacing w:line="480" w:lineRule="auto" w:after="240"/>
+        <w:ind w:left="720" w:hanging="360"/>
+      </w:pPr>
+      <w:r>
+        <w:rPr>
+          <w:b/>
+        </w:rPr>
+        <w:t>3.</w:t>
+        <w:tab/>
+      </w:r>
+      <w:r>
+        <w:rPr>
+          <w:b/>
+        </w:rPr>
+        <w:t>Online-to-Offline Model Revalidation Pipeline.</w:t>
+      </w:r>
+      <w:r>
+        <w:rPr>
+          <w:b w:val="0"/>
+        </w:rPr>
+        <w:t xml:space="preserve"> The AI classification module should be revalidated on an annual basis using new COG-format dummy documents to account for the evolution of document formatting, scanning equipment, and forgery techniques. A semi-automated revalidation pipeline—where new documents are labeled, processed, and used to fine-tune the existing model—should be documented in the System Administration Manual for the designated system custodian.</w:t>
+      </w:r>
+    </w:p>
+    <w:p>
+      <w:pPr>
+        <w:spacing w:line="480" w:lineRule="auto" w:after="240"/>
+        <w:ind w:left="720" w:hanging="360"/>
+      </w:pPr>
+      <w:r>
+        <w:rPr>
+          <w:b/>
+        </w:rPr>
+        <w:t>4.</w:t>
+        <w:tab/>
+      </w:r>
+      <w:r>
+        <w:rPr>
+          <w:b/>
+        </w:rPr>
+        <w:t>Real-Time WebSocket-Based AI Status Updates.</w:t>
+      </w:r>
+      <w:r>
+        <w:rPr>
+          <w:b w:val="0"/>
+        </w:rPr>
+        <w:t xml:space="preserve"> The current implementation uses a page-refresh polling mechanism to check the status of an in-progress AI scan. A future version should implement Laravel Echo with WebSockets or Server-Sent Events to push scan completion notifications to the administrator dashboard in real time, eliminating the need for page reloads and improving the responsiveness of the review interface.</w:t>
+      </w:r>
+    </w:p>
+    <w:p>
+      <w:pPr>
+        <w:spacing w:line="480" w:lineRule="auto" w:after="240"/>
+        <w:ind w:left="720" w:hanging="360"/>
+      </w:pPr>
+      <w:r>
+        <w:rPr>
+          <w:b/>
+        </w:rPr>
+        <w:t>5.</w:t>
+        <w:tab/>
+      </w:r>
+      <w:r>
+        <w:rPr>
+          <w:b/>
+        </w:rPr>
+        <w:t>Mobile-Responsive Progressive Web Application (PWA).</w:t>
+      </w:r>
+      <w:r>
+        <w:rPr>
+          <w:b w:val="0"/>
+        </w:rPr>
+        <w:t xml:space="preserve"> While A.E.G.I.S. is designed to be responsive across device sizes, it is not a dedicated mobile application. Packaging the student portal as a Progressive Web Application would allow students to install it on their home screen, receive push notifications for status changes, and use the portal with reduced data usage through service worker caching.</w:t>
+      </w:r>
+    </w:p>
+    <w:p>
+      <w:pPr>
+        <w:spacing w:line="480" w:lineRule="auto" w:after="240"/>
+        <w:ind w:left="720" w:hanging="360"/>
+      </w:pPr>
+      <w:r>
+        <w:rPr>
+          <w:b/>
+        </w:rPr>
+        <w:t>6.</w:t>
+        <w:tab/>
+      </w:r>
+      <w:r>
+        <w:rPr>
+          <w:b/>
+        </w:rPr>
+        <w:t>Financial Disbursement Module.</w:t>
+      </w:r>
+      <w:r>
+        <w:rPr>
+          <w:b w:val="0"/>
+        </w:rPr>
+        <w:t xml:space="preserve"> The current scope explicitly excludes financial computation and fund disbursement. A future version, developed in coordination with the CLSU Accounting Office, could extend the system to track scholarship grant amounts, disbursement schedules, and payment confirmation records, creating a fully integrated scholarship lifecycle management platform.</w:t>
+      </w:r>
+    </w:p>
+    <w:p>
+      <w:pPr>
+        <w:spacing w:line="480" w:lineRule="auto" w:after="240"/>
+        <w:ind w:left="720" w:hanging="360"/>
+      </w:pPr>
+      <w:r>
+        <w:rPr>
+          <w:b/>
+        </w:rPr>
+        <w:t>7.</w:t>
+        <w:tab/>
+      </w:r>
+      <w:r>
+        <w:rPr>
+          <w:b/>
+        </w:rPr>
+        <w:t>Expansion to Other Philippine HEIs.</w:t>
+      </w:r>
+      <w:r>
+        <w:rPr>
+          <w:b w:val="0"/>
+        </w:rPr>
+        <w:t xml:space="preserve"> The A.E.G.I.S. architecture is not CLSU-specific. The scholarship program management, AI document verification pipeline, and ISO/IEC 25010 evaluation framework can be generalized for deployment at other state universities and higher education institutions facing similar operational challenges. Future researchers may evaluate the system's transferability by conducting a multi-site deployment study with two or more HEIs and comparing UAT outcomes across institutional contexts.</w:t>
+      </w:r>
+    </w:p>
+    <w:p>
+      <w:pPr>
+        <w:spacing w:line="480" w:lineRule="auto" w:after="240"/>
+        <w:ind w:left="720" w:hanging="360"/>
+      </w:pPr>
+      <w:r>
+        <w:rPr>
+          <w:b/>
+        </w:rPr>
+        <w:t>8.</w:t>
+        <w:tab/>
+      </w:r>
+      <w:r>
+        <w:rPr>
+          <w:b/>
+        </w:rPr>
+        <w:t>Multi-Language Support.</w:t>
+      </w:r>
+      <w:r>
+        <w:rPr>
+          <w:b w:val="0"/>
+        </w:rPr>
+        <w:t xml:space="preserve"> To serve a broader range of students, particularly those enrolled in programs outside of Engineering and IT, the student portal interface should be extended with Filipino-language translations of key instructions, error messages, and status updates. This would reduce usability barriers for students with limited English proficiency and improve inclusivity in the scholarship application process.</w:t>
+      </w:r>
+    </w:p>
+    <w:p>
+      <w:pPr>
+        <w:spacing w:line="480" w:lineRule="auto" w:after="240"/>
+      </w:pPr>
+      <w:r>
+        <w:rPr>
+          <w:b w:val="0"/>
+        </w:rPr>
+        <w:t>*End of Chapter V*</w:t>
+      </w:r>
     </w:p>
     <w:p>
       <w:pPr>

</xml_diff>

<commit_message>
feat: Add Dockerfile and configs for PostgreSQL (Render/Supabase) and new workflows
</commit_message>
<xml_diff>
--- a/edited-AEGIS.docx
+++ b/edited-AEGIS.docx
@@ -15542,6 +15542,62 @@
     </w:p>
     <w:p>
       <w:pPr>
+        <w:pStyle w:val="Heading3"/>
+      </w:pPr>
+      <w:r>
+        <w:t>Work Item 6: Mobile Responsiveness &amp; Design Adaptive Architecture</w:t>
+      </w:r>
+    </w:p>
+    <w:p>
+      <w:pPr/>
+      <w:r>
+        <w:t>To support student submissions via mobile devices and enable on-the-go reviews for GAD administrators, an adaptive user interface architecture was designed. This includes media queries targeting screen viewports smaller than 768px, collapsible navbars, slide-out sidebar drawers, and responsive table containers to prevent data overflow.</w:t>
+      </w:r>
+    </w:p>
+    <w:p>
+      <w:pPr>
+        <w:pStyle w:val="Heading3"/>
+      </w:pPr>
+      <w:r>
+        <w:t>Work Item 7: Advanced Workflows &amp; Custom Forms Builder</w:t>
+      </w:r>
+    </w:p>
+    <w:p>
+      <w:pPr/>
+      <w:r>
+        <w:t>To enable dynamic scholarship form customizations, tables for scholarship_fields were added. The database structure was expanded with user active flags to support account deactivation and application archiving attributes. Real-time notification logs and layout alert indicators were designed to handle internal user-to-user action notifications.</w:t>
+      </w:r>
+    </w:p>
+    <w:p>
+      <w:pPr>
+        <w:pStyle w:val="Heading3"/>
+      </w:pPr>
+      <w:r>
+        <w:t>Work Item 8: Systematic Security Hardening</w:t>
+      </w:r>
+    </w:p>
+    <w:p>
+      <w:pPr/>
+      <w:r>
+        <w:t>To mitigate database brute-force attempts and direct script execution exploits, we designed middleware integrations mapping rate-limiting rules onto auth submission endpoints, a global SecurityHeaders compiler, and an Apache upload folder script restriction script.</w:t>
+      </w:r>
+    </w:p>
+    <w:p>
+      <w:pPr>
+        <w:pStyle w:val="Heading3"/>
+      </w:pPr>
+      <w:r>
+        <w:t>Work Item 9: Database Query Caching</w:t>
+      </w:r>
+    </w:p>
+    <w:p>
+      <w:pPr/>
+      <w:r>
+        <w:t>To optimize database performance, we mapped caching rules using memory-based key value stores (Redis/file) for static configuration components (Active Term and Active Scholarships). Eloquent booted event listeners were integrated to flush caching entries immediately upon database updates.</w:t>
+      </w:r>
+    </w:p>
+    <w:p>
+      <w:pPr>
         <w:spacing w:line="480" w:lineRule="auto"/>
         <w:ind w:left="720" w:firstLine="720"/>
         <w:jc w:val="both"/>
@@ -18996,6 +19052,90 @@
     </w:p>
     <w:p>
       <w:pPr>
+        <w:pStyle w:val="Heading3"/>
+      </w:pPr>
+      <w:r>
+        <w:t>Work Item 6: Mobile Responsiveness &amp; UI/UX Enhancements</w:t>
+      </w:r>
+    </w:p>
+    <w:p>
+      <w:pPr/>
+      <w:r>
+        <w:t>The mobile interface was implemented using custom media queries and collapsible Bootstrap 5 navigation bars. The admin layout dynamically collapses the sidebar into a sliding off-screen drawer managed via responsive toggle buttons and backdrop overlays. Test runs under mobile device simulation confirmed zero table overflow and clean reading margins on smaller viewports.</w:t>
+      </w:r>
+    </w:p>
+    <w:p>
+      <w:pPr>
+        <w:pStyle w:val="Heading3"/>
+      </w:pPr>
+      <w:r>
+        <w:t>Work Item 7: Advanced Workflows &amp; Custom Forms Builder</w:t>
+      </w:r>
+    </w:p>
+    <w:p>
+      <w:pPr/>
+      <w:r>
+        <w:t>The advanced portal features are fully operational. Superadmins can lock or activate staff accounts, which restricts revoked users from logging in. Administrators can archive applications to clean their dashboard queues. The custom form builder allows superadmins to dynamically add fields (text, number, files) to scholarship templates, which are dynamically validated on submission and stored encrypted in the database using AES-256 casting.</w:t>
+      </w:r>
+    </w:p>
+    <w:p>
+      <w:pPr>
+        <w:pStyle w:val="Heading3"/>
+      </w:pPr>
+      <w:r>
+        <w:t>Work Item 8: Systematic Security Hardening</w:t>
+      </w:r>
+    </w:p>
+    <w:p>
+      <w:pPr/>
+      <w:r>
+        <w:t>Security hardening was successfully deployed. Rate limiting on the /login and /register routes triggers an HTTP 429 status after 5 failed attempts in 1 minute. The global SecurityHeaders middleware attaches anti-clickjacking (X-Frame-Options: SAMEORIGIN), nosniff, and Content-Security-Policy (CSP) headers to all outgoing responses. The public uploads directory is secured with an .htaccess file blocking any CGI or PHP direct script executions.</w:t>
+      </w:r>
+    </w:p>
+    <w:p>
+      <w:pPr>
+        <w:pStyle w:val="Heading3"/>
+      </w:pPr>
+      <w:r>
+        <w:t>Work Item 9: Database Query Caching</w:t>
+      </w:r>
+    </w:p>
+    <w:p>
+      <w:pPr>
+        <w:pStyle w:val="Heading3"/>
+      </w:pPr>
+      <w:r>
+        <w:t>Work Item 10: Docker Compose Containerization</w:t>
+      </w:r>
+    </w:p>
+    <w:p>
+      <w:pPr/>
+      <w:r>
+        <w:t>Multi-container virtualization was successfully deployed for Strategy 1. We built FPM images on alpine runtimes and gunicorn images on Python slim runtimes. Nginx acts as the front proxy in a dedicated alpine container routing PHP requests to the laravel backend container and AI analysis requests to the Flask container on port 5000, isolating server boundaries.</w:t>
+      </w:r>
+    </w:p>
+    <w:p>
+      <w:pPr>
+        <w:pStyle w:val="Heading3"/>
+      </w:pPr>
+      <w:r>
+        <w:t>Work Item 10: Docker Compose Containerization</w:t>
+      </w:r>
+    </w:p>
+    <w:p>
+      <w:pPr/>
+      <w:r>
+        <w:t>To facilitate robust, multi-tier hosting, we designed a containerized infrastructure schema. This partitions the system into independent service containers for Laravel (PHP-FPM FPM), the Python Flask microservice, and Nginx. Orchestration of these services, alongside mount volumes for uploads, is configured inside a root docker-compose schema.</w:t>
+      </w:r>
+    </w:p>
+    <w:p>
+      <w:pPr/>
+      <w:r>
+        <w:t>Database query caching was integrated to improve read response times. The active scholarships listing is cached using a TTL of 3,600 seconds, and the active academic term is cached with a TTL of 86,400 seconds. Booted event listeners inside the AcademicTerm and Scholarship models automatically burst these caches upon database save or delete events, preventing stale data delivery.</w:t>
+      </w:r>
+    </w:p>
+    <w:p>
+      <w:pPr>
         <w:spacing w:line="480" w:lineRule="auto" w:after="240"/>
       </w:pPr>
       <w:r>
@@ -20604,6 +20744,24 @@
           <w:b w:val="0"/>
         </w:rPr>
         <w:t>Recommendations</w:t>
+      </w:r>
+    </w:p>
+    <w:p>
+      <w:pPr/>
+      <w:r>
+        <w:t>9. Optimization of High-Traffic Query Caching. During peak application periods, the database query caching layer should be switched to an in-memory Redis cluster. This reduces database I/O times to sub-millisecond ranges and prevents database locking under concurrent student requests.</w:t>
+      </w:r>
+    </w:p>
+    <w:p>
+      <w:pPr/>
+      <w:r>
+        <w:t>10. Implementation of Automated CI/CD Testing. Development teams should maintain an automated integration pipeline (e.g., GitHub Actions) to run the 50 automated PHPUnit verification tests on every pull request, preventing regressions and security header misconfigurations before merge.</w:t>
+      </w:r>
+    </w:p>
+    <w:p>
+      <w:pPr/>
+      <w:r>
+        <w:t>11. Deployment via Container Orchestration. To simplify system maintenance, software custodians should deploy the application using Docker Compose. This encapsulates the PHP and Python runtime configurations, ensuring consistency across hosting updates and preventing library version conflicts on the host system.</w:t>
       </w:r>
     </w:p>
     <w:p>

</xml_diff>